<commit_message>
Deploy preview for PR 562 🛫
</commit_message>
<xml_diff>
--- a/pr-preview/pr-562/UCD-SeRG-Lab-Manual-tracked-changes.docx
+++ b/pr-preview/pr-562/UCD-SeRG-Lab-Manual-tracked-changes.docx
@@ -335,7 +335,7 @@
       </w:ins>
     </w:p>
     <w:bookmarkEnd w:id="16"/>
-    <w:bookmarkStart w:id="19" w:name="sec-protecting-human-subjects"/>
+    <w:bookmarkStart w:id="18" w:name="sec-protecting-human-subjects"/>
     <w:p>
       <w:pPr>
         <w:pStyle w:val="Heading2"/>
@@ -409,16 +409,26 @@
         <w:t xml:space="preserve">Remember, data that looks like it does not contain identifiers to you might still be classified as data that requires special protection by our IRB or under HIPAA, so always proceed with caution and ask for help if you have any concerns about how to maintain study participant confidentiality.</w:t>
       </w:r>
     </w:p>
-    <w:p>
-      <w:pPr>
-        <w:pStyle w:val="BodyText"/>
-      </w:pPr>
-      <w:ins w:id="23" w:author="PR Preview" w:date="2024-01-01T00:00:00Z">
+    <w:bookmarkEnd w:id="18"/>
+    <w:bookmarkStart w:id="19" w:name="authorship"/>
+    <w:p>
+      <w:pPr>
+        <w:pStyle w:val="Heading2"/>
+      </w:pPr>
+      <w:r>
+        <w:t xml:space="preserve">2.4 Authorship</w:t>
+      </w:r>
+    </w:p>
+    <w:p>
+      <w:pPr>
+        <w:pStyle w:val="FirstParagraph"/>
+      </w:pPr>
+      <w:ins w:id="24" w:author="PR Preview" w:date="2024-01-01T00:00:00Z">
         <w:r>
           <w:t xml:space="preserve">Our authorship policy has moved to</w:t>
         </w:r>
       </w:ins>
-      <w:ins w:id="23" w:author="PR Preview" w:date="2024-01-01T00:00:00Z">
+      <w:ins w:id="24" w:author="PR Preview" w:date="2024-01-01T00:00:00Z">
         <w:r>
           <w:t xml:space="preserve"> </w:t>
         </w:r>
@@ -431,23 +441,16 @@
           <w:t xml:space="preserve">Authorship</w:t>
         </w:r>
       </w:hyperlink>
-      <w:ins w:id="23" w:author="PR Preview" w:date="2024-01-01T00:00:00Z">
+      <w:ins w:id="24" w:author="PR Preview" w:date="2024-01-01T00:00:00Z">
         <w:r>
           <w:t xml:space="preserve"> </w:t>
         </w:r>
       </w:ins>
-      <w:ins w:id="23" w:author="PR Preview" w:date="2024-01-01T00:00:00Z">
+      <w:ins w:id="24" w:author="PR Preview" w:date="2024-01-01T00:00:00Z">
         <w:r>
           <w:t xml:space="preserve">in the Manuscript Preparation chapter.</w:t>
         </w:r>
       </w:ins>
-      <w:ins w:id="23" w:author="PR Preview" w:date="2024-01-01T00:00:00Z">
-        <w:r>
-          <w:t xml:space="preserve"> </w:t>
-        </w:r>
-      </w:ins>
-      <w:bookmarkStart w:id="18" w:name="authorship"/>
-      <w:bookmarkEnd w:id="18"/>
     </w:p>
     <w:p>
       <w:r>
@@ -815,27 +818,27 @@
           <w:numId w:val="1003"/>
         </w:numPr>
       </w:pPr>
-      <w:ins w:id="38" w:author="PR Preview" w:date="2024-01-01T00:00:00Z">
+      <w:ins w:id="39" w:author="PR Preview" w:date="2024-01-01T00:00:00Z">
         <w:r>
           <w:t xml:space="preserve">Generally, strive to respond within two working days when you are directly addressed in an email.</w:t>
         </w:r>
       </w:ins>
-      <w:ins w:id="38" w:author="PR Preview" w:date="2024-01-01T00:00:00Z">
+      <w:ins w:id="39" w:author="PR Preview" w:date="2024-01-01T00:00:00Z">
         <w:r>
           <w:t xml:space="preserve"> </w:t>
         </w:r>
       </w:ins>
-      <w:ins w:id="38" w:author="PR Preview" w:date="2024-01-01T00:00:00Z">
+      <w:ins w:id="39" w:author="PR Preview" w:date="2024-01-01T00:00:00Z">
         <w:r>
           <w:t xml:space="preserve">If you’re on vacation, you’re not expected to respond until the end of your first work day back</w:t>
         </w:r>
       </w:ins>
-      <w:ins w:id="38" w:author="PR Preview" w:date="2024-01-01T00:00:00Z">
+      <w:ins w:id="39" w:author="PR Preview" w:date="2024-01-01T00:00:00Z">
         <w:r>
           <w:t xml:space="preserve"> </w:t>
         </w:r>
       </w:ins>
-      <w:ins w:id="38" w:author="PR Preview" w:date="2024-01-01T00:00:00Z">
+      <w:ins w:id="39" w:author="PR Preview" w:date="2024-01-01T00:00:00Z">
         <w:r>
           <w:t xml:space="preserve">(or possibly longer, if you’ve been out for a while and have a backlog).</w:t>
         </w:r>
@@ -1199,7 +1202,7 @@
           <w:numId w:val="1005"/>
         </w:numPr>
       </w:pPr>
-      <w:ins w:id="49" w:author="PR Preview" w:date="2024-01-01T00:00:00Z">
+      <w:ins w:id="50" w:author="PR Preview" w:date="2024-01-01T00:00:00Z">
         <w:r>
           <w:rPr>
             <w:b/>
@@ -1208,57 +1211,57 @@
           <w:t xml:space="preserve">Sending messages outside work hours</w:t>
         </w:r>
       </w:ins>
-      <w:ins w:id="49" w:author="PR Preview" w:date="2024-01-01T00:00:00Z">
+      <w:ins w:id="50" w:author="PR Preview" w:date="2024-01-01T00:00:00Z">
         <w:r>
           <w:t xml:space="preserve">:</w:t>
         </w:r>
       </w:ins>
-      <w:ins w:id="49" w:author="PR Preview" w:date="2024-01-01T00:00:00Z">
+      <w:ins w:id="50" w:author="PR Preview" w:date="2024-01-01T00:00:00Z">
         <w:r>
           <w:t xml:space="preserve"> </w:t>
         </w:r>
       </w:ins>
-      <w:ins w:id="49" w:author="PR Preview" w:date="2024-01-01T00:00:00Z">
+      <w:ins w:id="50" w:author="PR Preview" w:date="2024-01-01T00:00:00Z">
         <w:r>
           <w:t xml:space="preserve">Because we work across many time zones,</w:t>
         </w:r>
       </w:ins>
-      <w:ins w:id="49" w:author="PR Preview" w:date="2024-01-01T00:00:00Z">
+      <w:ins w:id="50" w:author="PR Preview" w:date="2024-01-01T00:00:00Z">
         <w:r>
           <w:t xml:space="preserve"> </w:t>
         </w:r>
       </w:ins>
-      <w:ins w:id="49" w:author="PR Preview" w:date="2024-01-01T00:00:00Z">
+      <w:ins w:id="50" w:author="PR Preview" w:date="2024-01-01T00:00:00Z">
         <w:r>
           <w:t xml:space="preserve">there’s no expectation to only send emails or messages during normal work hours.</w:t>
         </w:r>
       </w:ins>
-      <w:ins w:id="49" w:author="PR Preview" w:date="2024-01-01T00:00:00Z">
+      <w:ins w:id="50" w:author="PR Preview" w:date="2024-01-01T00:00:00Z">
         <w:r>
           <w:t xml:space="preserve"> </w:t>
         </w:r>
       </w:ins>
-      <w:ins w:id="49" w:author="PR Preview" w:date="2024-01-01T00:00:00Z">
+      <w:ins w:id="50" w:author="PR Preview" w:date="2024-01-01T00:00:00Z">
         <w:r>
           <w:t xml:space="preserve">Feel free to send messages whenever you compose them—don’t spend effort scheduling messages for later delivery.</w:t>
         </w:r>
       </w:ins>
-      <w:ins w:id="49" w:author="PR Preview" w:date="2024-01-01T00:00:00Z">
+      <w:ins w:id="50" w:author="PR Preview" w:date="2024-01-01T00:00:00Z">
         <w:r>
           <w:t xml:space="preserve"> </w:t>
         </w:r>
       </w:ins>
-      <w:ins w:id="49" w:author="PR Preview" w:date="2024-01-01T00:00:00Z">
+      <w:ins w:id="50" w:author="PR Preview" w:date="2024-01-01T00:00:00Z">
         <w:r>
           <w:t xml:space="preserve">Recipients will manage their own notification schedules,</w:t>
         </w:r>
       </w:ins>
-      <w:ins w:id="49" w:author="PR Preview" w:date="2024-01-01T00:00:00Z">
+      <w:ins w:id="50" w:author="PR Preview" w:date="2024-01-01T00:00:00Z">
         <w:r>
           <w:t xml:space="preserve"> </w:t>
         </w:r>
       </w:ins>
-      <w:ins w:id="49" w:author="PR Preview" w:date="2024-01-01T00:00:00Z">
+      <w:ins w:id="50" w:author="PR Preview" w:date="2024-01-01T00:00:00Z">
         <w:r>
           <w:t xml:space="preserve">and they may be working different hours or want the information sooner.</w:t>
         </w:r>
@@ -1512,37 +1515,37 @@
           <w:numId w:val="1010"/>
         </w:numPr>
       </w:pPr>
-      <w:ins w:id="63" w:author="PR Preview" w:date="2024-01-01T00:00:00Z">
-        <w:r>
-          <w:t xml:space="preserve">We mostly use Microsoft 365 to collaborate and write documents internally and GoogleDocs when working with external collaborators.</w:t>
+      <w:ins w:id="64" w:author="PR Preview" w:date="2024-01-01T00:00:00Z">
+        <w:r>
+          <w:t xml:space="preserve">We mostly use Microsoft 365 to collaborate and write documents internally and Google Docs when working with external collaborators.</w:t>
         </w:r>
       </w:ins>
-      <w:ins w:id="63" w:author="PR Preview" w:date="2024-01-01T00:00:00Z">
+      <w:ins w:id="64" w:author="PR Preview" w:date="2024-01-01T00:00:00Z">
         <w:r>
           <w:t xml:space="preserve"> </w:t>
         </w:r>
       </w:ins>
-      <w:ins w:id="63" w:author="PR Preview" w:date="2024-01-01T00:00:00Z">
+      <w:ins w:id="64" w:author="PR Preview" w:date="2024-01-01T00:00:00Z">
         <w:r>
           <w:t xml:space="preserve">These documents may be linked to in GitHub Issues or other task tracking tools.</w:t>
         </w:r>
       </w:ins>
-      <w:ins w:id="63" w:author="PR Preview" w:date="2024-01-01T00:00:00Z">
+      <w:ins w:id="64" w:author="PR Preview" w:date="2024-01-01T00:00:00Z">
         <w:r>
           <w:t xml:space="preserve"> </w:t>
         </w:r>
       </w:ins>
-      <w:ins w:id="63" w:author="PR Preview" w:date="2024-01-01T00:00:00Z">
+      <w:ins w:id="64" w:author="PR Preview" w:date="2024-01-01T00:00:00Z">
         <w:r>
           <w:t xml:space="preserve">Lab leadership often shares these with the whole team since tasks are overlapping,</w:t>
         </w:r>
       </w:ins>
-      <w:ins w:id="63" w:author="PR Preview" w:date="2024-01-01T00:00:00Z">
+      <w:ins w:id="64" w:author="PR Preview" w:date="2024-01-01T00:00:00Z">
         <w:r>
           <w:t xml:space="preserve"> </w:t>
         </w:r>
       </w:ins>
-      <w:ins w:id="63" w:author="PR Preview" w:date="2024-01-01T00:00:00Z">
+      <w:ins w:id="64" w:author="PR Preview" w:date="2024-01-01T00:00:00Z">
         <w:r>
           <w:t xml:space="preserve">and even if a task is assigned to one person, others may have valuable insights.</w:t>
         </w:r>
@@ -23278,7 +23281,7 @@
           <w:numId w:val="1123"/>
         </w:numPr>
       </w:pPr>
-      <w:ins w:id="741" w:author="PR Preview" w:date="2024-01-01T00:00:00Z">
+      <w:ins w:id="742" w:author="PR Preview" w:date="2024-01-01T00:00:00Z">
         <w:r>
           <w:rPr>
             <w:b/>
@@ -23287,42 +23290,42 @@
           <w:t xml:space="preserve">Approaching reviewer feedback</w:t>
         </w:r>
       </w:ins>
-      <w:ins w:id="741" w:author="PR Preview" w:date="2024-01-01T00:00:00Z">
+      <w:ins w:id="742" w:author="PR Preview" w:date="2024-01-01T00:00:00Z">
         <w:r>
           <w:t xml:space="preserve">: Read peer reviews,</w:t>
         </w:r>
       </w:ins>
-      <w:ins w:id="741" w:author="PR Preview" w:date="2024-01-01T00:00:00Z">
+      <w:ins w:id="742" w:author="PR Preview" w:date="2024-01-01T00:00:00Z">
         <w:r>
           <w:t xml:space="preserve"> </w:t>
         </w:r>
       </w:ins>
-      <w:ins w:id="741" w:author="PR Preview" w:date="2024-01-01T00:00:00Z">
+      <w:ins w:id="742" w:author="PR Preview" w:date="2024-01-01T00:00:00Z">
         <w:r>
           <w:t xml:space="preserve">step back for a day to process feedback,</w:t>
         </w:r>
       </w:ins>
-      <w:ins w:id="741" w:author="PR Preview" w:date="2024-01-01T00:00:00Z">
+      <w:ins w:id="742" w:author="PR Preview" w:date="2024-01-01T00:00:00Z">
         <w:r>
           <w:t xml:space="preserve"> </w:t>
         </w:r>
       </w:ins>
-      <w:ins w:id="741" w:author="PR Preview" w:date="2024-01-01T00:00:00Z">
+      <w:ins w:id="742" w:author="PR Preview" w:date="2024-01-01T00:00:00Z">
         <w:r>
           <w:t xml:space="preserve">and draft systematic, point-by-point response letters</w:t>
         </w:r>
       </w:ins>
-      <w:ins w:id="741" w:author="PR Preview" w:date="2024-01-01T00:00:00Z">
+      <w:ins w:id="742" w:author="PR Preview" w:date="2024-01-01T00:00:00Z">
         <w:r>
           <w:t xml:space="preserve"> </w:t>
         </w:r>
       </w:ins>
-      <w:ins w:id="741" w:author="PR Preview" w:date="2024-01-01T00:00:00Z">
+      <w:ins w:id="742" w:author="PR Preview" w:date="2024-01-01T00:00:00Z">
         <w:r>
           <w:t xml:space="preserve">using the guidance in</w:t>
         </w:r>
       </w:ins>
-      <w:ins w:id="741" w:author="PR Preview" w:date="2024-01-01T00:00:00Z">
+      <w:ins w:id="742" w:author="PR Preview" w:date="2024-01-01T00:00:00Z">
         <w:r>
           <w:t xml:space="preserve"> </w:t>
         </w:r>
@@ -23335,7 +23338,7 @@
           <w:t xml:space="preserve">Section 24.3</w:t>
         </w:r>
       </w:hyperlink>
-      <w:ins w:id="741" w:author="PR Preview" w:date="2024-01-01T00:00:00Z">
+      <w:ins w:id="742" w:author="PR Preview" w:date="2024-01-01T00:00:00Z">
         <w:r>
           <w:t xml:space="preserve">.</w:t>
         </w:r>
@@ -23349,7 +23352,7 @@
           <w:numId w:val="1123"/>
         </w:numPr>
       </w:pPr>
-      <w:ins w:id="742" w:author="PR Preview" w:date="2024-01-01T00:00:00Z">
+      <w:ins w:id="743" w:author="PR Preview" w:date="2024-01-01T00:00:00Z">
         <w:r>
           <w:rPr>
             <w:b/>
@@ -23358,32 +23361,32 @@
           <w:t xml:space="preserve">Authorship conversations</w:t>
         </w:r>
       </w:ins>
-      <w:ins w:id="742" w:author="PR Preview" w:date="2024-01-01T00:00:00Z">
+      <w:ins w:id="743" w:author="PR Preview" w:date="2024-01-01T00:00:00Z">
         <w:r>
           <w:t xml:space="preserve">: Initiate discussions regarding authorship order</w:t>
         </w:r>
       </w:ins>
-      <w:ins w:id="742" w:author="PR Preview" w:date="2024-01-01T00:00:00Z">
+      <w:ins w:id="743" w:author="PR Preview" w:date="2024-01-01T00:00:00Z">
         <w:r>
           <w:t xml:space="preserve"> </w:t>
         </w:r>
       </w:ins>
-      <w:ins w:id="742" w:author="PR Preview" w:date="2024-01-01T00:00:00Z">
+      <w:ins w:id="743" w:author="PR Preview" w:date="2024-01-01T00:00:00Z">
         <w:r>
           <w:t xml:space="preserve">and contribution roles early in every project and revisit them regularly</w:t>
         </w:r>
       </w:ins>
-      <w:ins w:id="742" w:author="PR Preview" w:date="2024-01-01T00:00:00Z">
+      <w:ins w:id="743" w:author="PR Preview" w:date="2024-01-01T00:00:00Z">
         <w:r>
           <w:t xml:space="preserve"> </w:t>
         </w:r>
       </w:ins>
-      <w:ins w:id="742" w:author="PR Preview" w:date="2024-01-01T00:00:00Z">
+      <w:ins w:id="743" w:author="PR Preview" w:date="2024-01-01T00:00:00Z">
         <w:r>
           <w:t xml:space="preserve">(see</w:t>
         </w:r>
       </w:ins>
-      <w:ins w:id="742" w:author="PR Preview" w:date="2024-01-01T00:00:00Z">
+      <w:ins w:id="743" w:author="PR Preview" w:date="2024-01-01T00:00:00Z">
         <w:r>
           <w:t xml:space="preserve"> </w:t>
         </w:r>
@@ -23396,7 +23399,7 @@
           <w:t xml:space="preserve">Section 24.2</w:t>
         </w:r>
       </w:hyperlink>
-      <w:ins w:id="742" w:author="PR Preview" w:date="2024-01-01T00:00:00Z">
+      <w:ins w:id="743" w:author="PR Preview" w:date="2024-01-01T00:00:00Z">
         <w:r>
           <w:t xml:space="preserve">).</w:t>
         </w:r>
@@ -23744,12 +23747,12 @@
           <w:numId w:val="1126"/>
         </w:numPr>
       </w:pPr>
-      <w:ins w:id="1763" w:author="PR Preview" w:date="2024-01-01T00:00:00Z">
+      <w:ins w:id="1764" w:author="PR Preview" w:date="2024-01-01T00:00:00Z">
         <w:r>
           <w:t xml:space="preserve">We recommend that all our UC Davis graduate students enroll in the</w:t>
         </w:r>
       </w:ins>
-      <w:ins w:id="1763" w:author="PR Preview" w:date="2024-01-01T00:00:00Z">
+      <w:ins w:id="1764" w:author="PR Preview" w:date="2024-01-01T00:00:00Z">
         <w:r>
           <w:t xml:space="preserve"> </w:t>
         </w:r>
@@ -23762,12 +23765,12 @@
           <w:t xml:space="preserve">Fellowship Award Writing course</w:t>
         </w:r>
       </w:hyperlink>
-      <w:ins w:id="1763" w:author="PR Preview" w:date="2024-01-01T00:00:00Z">
+      <w:ins w:id="1764" w:author="PR Preview" w:date="2024-01-01T00:00:00Z">
         <w:r>
           <w:t xml:space="preserve"> </w:t>
         </w:r>
       </w:ins>
-      <w:ins w:id="1763" w:author="PR Preview" w:date="2024-01-01T00:00:00Z">
+      <w:ins w:id="1764" w:author="PR Preview" w:date="2024-01-01T00:00:00Z">
         <w:r>
           <w:t xml:space="preserve">for NIH F31 and F32 applications</w:t>
         </w:r>
@@ -25968,7 +25971,7 @@
       <w:pPr>
         <w:pStyle w:val="Heading2"/>
       </w:pPr>
-      <w:ins w:id="865" w:author="PR Preview" w:date="2024-01-01T00:00:00Z">
+      <w:ins w:id="866" w:author="PR Preview" w:date="2024-01-01T00:00:00Z">
         <w:r>
           <w:t xml:space="preserve">24.2 Authorship</w:t>
         </w:r>
@@ -25978,12 +25981,12 @@
       <w:pPr>
         <w:pStyle w:val="FirstParagraph"/>
       </w:pPr>
-      <w:ins w:id="866" w:author="PR Preview" w:date="2024-01-01T00:00:00Z">
+      <w:ins w:id="867" w:author="PR Preview" w:date="2024-01-01T00:00:00Z">
         <w:r>
           <w:t xml:space="preserve">We adhere to the</w:t>
         </w:r>
       </w:ins>
-      <w:ins w:id="866" w:author="PR Preview" w:date="2024-01-01T00:00:00Z">
+      <w:ins w:id="867" w:author="PR Preview" w:date="2024-01-01T00:00:00Z">
         <w:r>
           <w:t xml:space="preserve"> </w:t>
         </w:r>
@@ -25996,32 +25999,32 @@
           <w:t xml:space="preserve">ICMJE Definition of authorship</w:t>
         </w:r>
       </w:hyperlink>
-      <w:ins w:id="866" w:author="PR Preview" w:date="2024-01-01T00:00:00Z">
+      <w:ins w:id="867" w:author="PR Preview" w:date="2024-01-01T00:00:00Z">
         <w:r>
           <w:t xml:space="preserve"> </w:t>
         </w:r>
       </w:ins>
-      <w:ins w:id="866" w:author="PR Preview" w:date="2024-01-01T00:00:00Z">
+      <w:ins w:id="867" w:author="PR Preview" w:date="2024-01-01T00:00:00Z">
         <w:r>
           <w:t xml:space="preserve">(International Committee of Medical Journal Editors, n.d.)</w:t>
         </w:r>
       </w:ins>
-      <w:ins w:id="866" w:author="PR Preview" w:date="2024-01-01T00:00:00Z">
+      <w:ins w:id="867" w:author="PR Preview" w:date="2024-01-01T00:00:00Z">
         <w:r>
           <w:t xml:space="preserve"> </w:t>
         </w:r>
       </w:ins>
-      <w:ins w:id="866" w:author="PR Preview" w:date="2024-01-01T00:00:00Z">
+      <w:ins w:id="867" w:author="PR Preview" w:date="2024-01-01T00:00:00Z">
         <w:r>
           <w:t xml:space="preserve">and are happy for team members who meet the definition of authorship to be included as co-authors on scientific manuscripts.</w:t>
         </w:r>
       </w:ins>
-      <w:ins w:id="866" w:author="PR Preview" w:date="2024-01-01T00:00:00Z">
+      <w:ins w:id="867" w:author="PR Preview" w:date="2024-01-01T00:00:00Z">
         <w:r>
           <w:t xml:space="preserve"> </w:t>
         </w:r>
       </w:ins>
-      <w:ins w:id="866" w:author="PR Preview" w:date="2024-01-01T00:00:00Z">
+      <w:ins w:id="867" w:author="PR Preview" w:date="2024-01-01T00:00:00Z">
         <w:r>
           <w:t xml:space="preserve">To qualify for authorship, individuals must meet all four criteria:</w:t>
         </w:r>
@@ -26035,7 +26038,7 @@
           <w:numId w:val="1141"/>
         </w:numPr>
       </w:pPr>
-      <w:ins w:id="867" w:author="PR Preview" w:date="2024-01-01T00:00:00Z">
+      <w:ins w:id="868" w:author="PR Preview" w:date="2024-01-01T00:00:00Z">
         <w:r>
           <w:t xml:space="preserve">Substantial contributions to conception/design, or acquisition/analysis/interpretation of data</w:t>
         </w:r>
@@ -26049,7 +26052,7 @@
           <w:numId w:val="1141"/>
         </w:numPr>
       </w:pPr>
-      <w:ins w:id="868" w:author="PR Preview" w:date="2024-01-01T00:00:00Z">
+      <w:ins w:id="869" w:author="PR Preview" w:date="2024-01-01T00:00:00Z">
         <w:r>
           <w:t xml:space="preserve">Drafting the work or revising it critically for important intellectual content</w:t>
         </w:r>
@@ -26063,7 +26066,7 @@
           <w:numId w:val="1141"/>
         </w:numPr>
       </w:pPr>
-      <w:ins w:id="869" w:author="PR Preview" w:date="2024-01-01T00:00:00Z">
+      <w:ins w:id="870" w:author="PR Preview" w:date="2024-01-01T00:00:00Z">
         <w:r>
           <w:t xml:space="preserve">Final approval of the version to be published</w:t>
         </w:r>
@@ -26077,7 +26080,7 @@
           <w:numId w:val="1141"/>
         </w:numPr>
       </w:pPr>
-      <w:ins w:id="870" w:author="PR Preview" w:date="2024-01-01T00:00:00Z">
+      <w:ins w:id="871" w:author="PR Preview" w:date="2024-01-01T00:00:00Z">
         <w:r>
           <w:t xml:space="preserve">Agreement to be accountable for all aspects of the work</w:t>
         </w:r>
@@ -26087,7 +26090,7 @@
       <w:pPr>
         <w:pStyle w:val="FirstParagraph"/>
       </w:pPr>
-      <w:ins w:id="871" w:author="PR Preview" w:date="2024-01-01T00:00:00Z">
+      <w:ins w:id="872" w:author="PR Preview" w:date="2024-01-01T00:00:00Z">
         <w:r>
           <w:rPr>
             <w:b/>
@@ -26105,7 +26108,7 @@
           <w:numId w:val="1142"/>
         </w:numPr>
       </w:pPr>
-      <w:ins w:id="872" w:author="PR Preview" w:date="2024-01-01T00:00:00Z">
+      <w:ins w:id="873" w:author="PR Preview" w:date="2024-01-01T00:00:00Z">
         <w:r>
           <w:rPr>
             <w:b/>
@@ -26114,27 +26117,27 @@
           <w:t xml:space="preserve">First authorship</w:t>
         </w:r>
       </w:ins>
-      <w:ins w:id="872" w:author="PR Preview" w:date="2024-01-01T00:00:00Z">
+      <w:ins w:id="873" w:author="PR Preview" w:date="2024-01-01T00:00:00Z">
         <w:r>
           <w:t xml:space="preserve">: Typically goes to the person who led the work.</w:t>
         </w:r>
       </w:ins>
-      <w:ins w:id="872" w:author="PR Preview" w:date="2024-01-01T00:00:00Z">
+      <w:ins w:id="873" w:author="PR Preview" w:date="2024-01-01T00:00:00Z">
         <w:r>
           <w:t xml:space="preserve"> </w:t>
         </w:r>
       </w:ins>
-      <w:ins w:id="872" w:author="PR Preview" w:date="2024-01-01T00:00:00Z">
+      <w:ins w:id="873" w:author="PR Preview" w:date="2024-01-01T00:00:00Z">
         <w:r>
           <w:t xml:space="preserve">For international collaborative projects,</w:t>
         </w:r>
       </w:ins>
-      <w:ins w:id="872" w:author="PR Preview" w:date="2024-01-01T00:00:00Z">
+      <w:ins w:id="873" w:author="PR Preview" w:date="2024-01-01T00:00:00Z">
         <w:r>
           <w:t xml:space="preserve"> </w:t>
         </w:r>
       </w:ins>
-      <w:ins w:id="872" w:author="PR Preview" w:date="2024-01-01T00:00:00Z">
+      <w:ins w:id="873" w:author="PR Preview" w:date="2024-01-01T00:00:00Z">
         <w:r>
           <w:t xml:space="preserve">first authorship is often shared between the people who lead data collection and analysis.</w:t>
         </w:r>
@@ -26148,7 +26151,7 @@
           <w:numId w:val="1142"/>
         </w:numPr>
       </w:pPr>
-      <w:ins w:id="873" w:author="PR Preview" w:date="2024-01-01T00:00:00Z">
+      <w:ins w:id="874" w:author="PR Preview" w:date="2024-01-01T00:00:00Z">
         <w:r>
           <w:rPr>
             <w:b/>
@@ -26157,9 +26160,9 @@
           <w:t xml:space="preserve">Corresponding author</w:t>
         </w:r>
       </w:ins>
-      <w:ins w:id="873" w:author="PR Preview" w:date="2024-01-01T00:00:00Z">
-        <w:r>
-          <w:t xml:space="preserve">: Usually Dr. Morrison or Dr. Aiemjoy, unless otherwise agreed</w:t>
+      <w:ins w:id="874" w:author="PR Preview" w:date="2024-01-01T00:00:00Z">
+        <w:r>
+          <w:t xml:space="preserve">: Usually Dr. Morrison or Dr. Aiemjoy, unless otherwise agreed.</w:t>
         </w:r>
       </w:ins>
     </w:p>
@@ -26171,7 +26174,7 @@
           <w:numId w:val="1142"/>
         </w:numPr>
       </w:pPr>
-      <w:ins w:id="874" w:author="PR Preview" w:date="2024-01-01T00:00:00Z">
+      <w:ins w:id="875" w:author="PR Preview" w:date="2024-01-01T00:00:00Z">
         <w:r>
           <w:rPr>
             <w:b/>
@@ -26180,9 +26183,9 @@
           <w:t xml:space="preserve">Co-authorship</w:t>
         </w:r>
       </w:ins>
-      <w:ins w:id="874" w:author="PR Preview" w:date="2024-01-01T00:00:00Z">
-        <w:r>
-          <w:t xml:space="preserve">: Determined by substantial intellectual contributions</w:t>
+      <w:ins w:id="875" w:author="PR Preview" w:date="2024-01-01T00:00:00Z">
+        <w:r>
+          <w:t xml:space="preserve">: Determined by substantial intellectual contributions.</w:t>
         </w:r>
       </w:ins>
     </w:p>
@@ -26194,7 +26197,7 @@
           <w:numId w:val="1142"/>
         </w:numPr>
       </w:pPr>
-      <w:ins w:id="875" w:author="PR Preview" w:date="2024-01-01T00:00:00Z">
+      <w:ins w:id="876" w:author="PR Preview" w:date="2024-01-01T00:00:00Z">
         <w:r>
           <w:rPr>
             <w:b/>
@@ -26203,9 +26206,9 @@
           <w:t xml:space="preserve">Author order</w:t>
         </w:r>
       </w:ins>
-      <w:ins w:id="875" w:author="PR Preview" w:date="2024-01-01T00:00:00Z">
-        <w:r>
-          <w:t xml:space="preserve">: Should be discussed and agreed upon by all authors</w:t>
+      <w:ins w:id="876" w:author="PR Preview" w:date="2024-01-01T00:00:00Z">
+        <w:r>
+          <w:t xml:space="preserve">: Should be discussed and agreed upon by all authors.</w:t>
         </w:r>
       </w:ins>
     </w:p>
@@ -26217,7 +26220,7 @@
           <w:numId w:val="1142"/>
         </w:numPr>
       </w:pPr>
-      <w:ins w:id="876" w:author="PR Preview" w:date="2024-01-01T00:00:00Z">
+      <w:ins w:id="877" w:author="PR Preview" w:date="2024-01-01T00:00:00Z">
         <w:r>
           <w:rPr>
             <w:b/>
@@ -26226,9 +26229,9 @@
           <w:t xml:space="preserve">Acknowledgments</w:t>
         </w:r>
       </w:ins>
-      <w:ins w:id="876" w:author="PR Preview" w:date="2024-01-01T00:00:00Z">
-        <w:r>
-          <w:t xml:space="preserve">: For contributions that don’t meet authorship criteria</w:t>
+      <w:ins w:id="877" w:author="PR Preview" w:date="2024-01-01T00:00:00Z">
+        <w:r>
+          <w:t xml:space="preserve">: For contributions that don’t meet authorship criteria.</w:t>
         </w:r>
       </w:ins>
     </w:p>
@@ -26236,22 +26239,22 @@
       <w:pPr>
         <w:pStyle w:val="FirstParagraph"/>
       </w:pPr>
-      <w:ins w:id="877" w:author="PR Preview" w:date="2024-01-01T00:00:00Z">
+      <w:ins w:id="878" w:author="PR Preview" w:date="2024-01-01T00:00:00Z">
         <w:r>
           <w:t xml:space="preserve">Authorship should be discussed early in a project and revisited as the work evolves to ensure transparency and fairness.</w:t>
         </w:r>
       </w:ins>
-      <w:ins w:id="877" w:author="PR Preview" w:date="2024-01-01T00:00:00Z">
+      <w:ins w:id="878" w:author="PR Preview" w:date="2024-01-01T00:00:00Z">
         <w:r>
           <w:t xml:space="preserve"> </w:t>
         </w:r>
       </w:ins>
-      <w:ins w:id="877" w:author="PR Preview" w:date="2024-01-01T00:00:00Z">
+      <w:ins w:id="878" w:author="PR Preview" w:date="2024-01-01T00:00:00Z">
         <w:r>
           <w:t xml:space="preserve">We encourage using the</w:t>
         </w:r>
       </w:ins>
-      <w:ins w:id="877" w:author="PR Preview" w:date="2024-01-01T00:00:00Z">
+      <w:ins w:id="878" w:author="PR Preview" w:date="2024-01-01T00:00:00Z">
         <w:r>
           <w:t xml:space="preserve"> </w:t>
         </w:r>
@@ -26264,12 +26267,12 @@
           <w:t xml:space="preserve">CRediT Taxonomy</w:t>
         </w:r>
       </w:hyperlink>
-      <w:ins w:id="877" w:author="PR Preview" w:date="2024-01-01T00:00:00Z">
+      <w:ins w:id="878" w:author="PR Preview" w:date="2024-01-01T00:00:00Z">
         <w:r>
           <w:t xml:space="preserve"> </w:t>
         </w:r>
       </w:ins>
-      <w:ins w:id="877" w:author="PR Preview" w:date="2024-01-01T00:00:00Z">
+      <w:ins w:id="878" w:author="PR Preview" w:date="2024-01-01T00:00:00Z">
         <w:r>
           <w:t xml:space="preserve">to document specific author contributions.</w:t>
         </w:r>
@@ -26281,7 +26284,7 @@
       <w:pPr>
         <w:pStyle w:val="Heading2"/>
       </w:pPr>
-      <w:ins w:id="878" w:author="PR Preview" w:date="2024-01-01T00:00:00Z">
+      <w:ins w:id="879" w:author="PR Preview" w:date="2024-01-01T00:00:00Z">
         <w:r>
           <w:t xml:space="preserve">24.3 Responding to Peer Review</w:t>
         </w:r>
@@ -26642,7 +26645,7 @@
       <w:pPr>
         <w:pStyle w:val="Heading2"/>
       </w:pPr>
-      <w:ins w:id="897" w:author="PR Preview" w:date="2024-01-01T00:00:00Z">
+      <w:ins w:id="898" w:author="PR Preview" w:date="2024-01-01T00:00:00Z">
         <w:r>
           <w:t xml:space="preserve">24.4 Preprints and Open Access</w:t>
         </w:r>
@@ -26752,7 +26755,7 @@
       <w:pPr>
         <w:pStyle w:val="Heading2"/>
       </w:pPr>
-      <w:ins w:id="903" w:author="PR Preview" w:date="2024-01-01T00:00:00Z">
+      <w:ins w:id="904" w:author="PR Preview" w:date="2024-01-01T00:00:00Z">
         <w:r>
           <w:t xml:space="preserve">24.5 Reporting Checklists</w:t>
         </w:r>
@@ -26834,7 +26837,7 @@
       <w:pPr>
         <w:pStyle w:val="Heading2"/>
       </w:pPr>
-      <w:ins w:id="909" w:author="PR Preview" w:date="2024-01-01T00:00:00Z">
+      <w:ins w:id="910" w:author="PR Preview" w:date="2024-01-01T00:00:00Z">
         <w:r>
           <w:t xml:space="preserve">24.6 Manuscript Checklist</w:t>
         </w:r>
@@ -27076,17 +27079,17 @@
       <w:pPr>
         <w:pStyle w:val="Heading2"/>
       </w:pPr>
-      <w:ins w:id="927" w:author="PR Preview" w:date="2024-01-01T00:00:00Z">
+      <w:ins w:id="928" w:author="PR Preview" w:date="2024-01-01T00:00:00Z">
         <w:r>
           <w:t xml:space="preserve">24.7 Formatting tables with</w:t>
         </w:r>
       </w:ins>
-      <w:ins w:id="927" w:author="PR Preview" w:date="2024-01-01T00:00:00Z">
+      <w:ins w:id="928" w:author="PR Preview" w:date="2024-01-01T00:00:00Z">
         <w:r>
           <w:t xml:space="preserve"> </w:t>
         </w:r>
       </w:ins>
-      <w:ins w:id="927" w:author="PR Preview" w:date="2024-01-01T00:00:00Z">
+      <w:ins w:id="928" w:author="PR Preview" w:date="2024-01-01T00:00:00Z">
         <w:r>
           <w:rPr>
             <w:rStyle w:val="VerbatimChar"/>
@@ -27094,22 +27097,22 @@
           <w:t xml:space="preserve">gtsummary</w:t>
         </w:r>
       </w:ins>
-      <w:ins w:id="927" w:author="PR Preview" w:date="2024-01-01T00:00:00Z">
+      <w:ins w:id="928" w:author="PR Preview" w:date="2024-01-01T00:00:00Z">
         <w:r>
           <w:t xml:space="preserve"> </w:t>
         </w:r>
       </w:ins>
-      <w:ins w:id="927" w:author="PR Preview" w:date="2024-01-01T00:00:00Z">
+      <w:ins w:id="928" w:author="PR Preview" w:date="2024-01-01T00:00:00Z">
         <w:r>
           <w:t xml:space="preserve">+</w:t>
         </w:r>
       </w:ins>
-      <w:ins w:id="927" w:author="PR Preview" w:date="2024-01-01T00:00:00Z">
+      <w:ins w:id="928" w:author="PR Preview" w:date="2024-01-01T00:00:00Z">
         <w:r>
           <w:t xml:space="preserve"> </w:t>
         </w:r>
       </w:ins>
-      <w:ins w:id="927" w:author="PR Preview" w:date="2024-01-01T00:00:00Z">
+      <w:ins w:id="928" w:author="PR Preview" w:date="2024-01-01T00:00:00Z">
         <w:r>
           <w:rPr>
             <w:rStyle w:val="VerbatimChar"/>
@@ -27117,22 +27120,22 @@
           <w:t xml:space="preserve">flextable</w:t>
         </w:r>
       </w:ins>
-      <w:ins w:id="927" w:author="PR Preview" w:date="2024-01-01T00:00:00Z">
+      <w:ins w:id="928" w:author="PR Preview" w:date="2024-01-01T00:00:00Z">
         <w:r>
           <w:t xml:space="preserve"> </w:t>
         </w:r>
       </w:ins>
-      <w:ins w:id="927" w:author="PR Preview" w:date="2024-01-01T00:00:00Z">
+      <w:ins w:id="928" w:author="PR Preview" w:date="2024-01-01T00:00:00Z">
         <w:r>
           <w:t xml:space="preserve">+</w:t>
         </w:r>
       </w:ins>
-      <w:ins w:id="927" w:author="PR Preview" w:date="2024-01-01T00:00:00Z">
+      <w:ins w:id="928" w:author="PR Preview" w:date="2024-01-01T00:00:00Z">
         <w:r>
           <w:t xml:space="preserve"> </w:t>
         </w:r>
       </w:ins>
-      <w:ins w:id="927" w:author="PR Preview" w:date="2024-01-01T00:00:00Z">
+      <w:ins w:id="928" w:author="PR Preview" w:date="2024-01-01T00:00:00Z">
         <w:r>
           <w:rPr>
             <w:rStyle w:val="VerbatimChar"/>
@@ -27576,7 +27579,7 @@
       <w:pPr>
         <w:pStyle w:val="Heading2"/>
       </w:pPr>
-      <w:ins w:id="934" w:author="PR Preview" w:date="2024-01-01T00:00:00Z">
+      <w:ins w:id="935" w:author="PR Preview" w:date="2024-01-01T00:00:00Z">
         <w:r>
           <w:t xml:space="preserve">24.8 Scientific Writing: Claims and Evidence</w:t>
         </w:r>
@@ -28181,35 +28184,49 @@
       <w:pPr>
         <w:pStyle w:val="Bibliography"/>
       </w:pPr>
-      <w:r>
-        <w:t xml:space="preserve">International Committee of Medical Journal Editors. n.d.</w:t>
-      </w:r>
-      <w:r>
-        <w:t xml:space="preserve"> </w:t>
-      </w:r>
-      <w:r>
-        <w:t xml:space="preserve">“Defining the Role of Authors and Contributors.”</w:t>
-      </w:r>
-      <w:r>
-        <w:t xml:space="preserve"> </w:t>
-      </w:r>
-      <w:r>
-        <w:t xml:space="preserve">ICMJE.</w:t>
-      </w:r>
-      <w:r>
-        <w:t xml:space="preserve"> </w:t>
-      </w:r>
+      <w:ins w:id="963" w:author="PR Preview" w:date="2024-01-01T00:00:00Z">
+        <w:r>
+          <w:t xml:space="preserve">International Committee of Medical Journal Editors. n.d.</w:t>
+        </w:r>
+      </w:ins>
+      <w:ins w:id="963" w:author="PR Preview" w:date="2024-01-01T00:00:00Z">
+        <w:r>
+          <w:t xml:space="preserve"> </w:t>
+        </w:r>
+      </w:ins>
+      <w:ins w:id="963" w:author="PR Preview" w:date="2024-01-01T00:00:00Z">
+        <w:r>
+          <w:t xml:space="preserve">“Defining the Role of Authors and Contributors.”</w:t>
+        </w:r>
+      </w:ins>
+      <w:ins w:id="963" w:author="PR Preview" w:date="2024-01-01T00:00:00Z">
+        <w:r>
+          <w:t xml:space="preserve"> </w:t>
+        </w:r>
+      </w:ins>
+      <w:ins w:id="963" w:author="PR Preview" w:date="2024-01-01T00:00:00Z">
+        <w:r>
+          <w:t xml:space="preserve">ICMJE.</w:t>
+        </w:r>
+      </w:ins>
+      <w:ins w:id="963" w:author="PR Preview" w:date="2024-01-01T00:00:00Z">
+        <w:r>
+          <w:t xml:space="preserve"> </w:t>
+        </w:r>
+      </w:ins>
       <w:hyperlink r:id="rId932">
         <w:r>
           <w:rPr>
             <w:rStyle w:val="Hyperlink"/>
           </w:rPr>
-          <w:t xml:space="preserve">http://www.icmje.org/recommendations/browse/roles-and-responsibilities/defining-the-role-of-authors-and-contributors.html</w:t>
+          <w:t xml:space="preserve">https://www.icmje.org/recommendations/browse/roles-and-responsibilities/defining-the-role-of-authors-and-contributors.html</w:t>
         </w:r>
       </w:hyperlink>
-      <w:r>
-        <w:t xml:space="preserve">.</w:t>
-      </w:r>
+      <w:ins w:id="963" w:author="PR Preview" w:date="2024-01-01T00:00:00Z">
+        <w:r>
+          <w:t xml:space="preserve">.</w:t>
+        </w:r>
+      </w:ins>
     </w:p>
     <w:bookmarkEnd w:id="962"/>
     <w:bookmarkStart w:id="964" w:name="ref-lamport2019think"/>
@@ -28885,7 +28902,7 @@
           <w:numId w:val="1166"/>
         </w:numPr>
       </w:pPr>
-      <w:ins w:id="987" w:author="PR Preview" w:date="2024-01-01T00:00:00Z">
+      <w:ins w:id="988" w:author="PR Preview" w:date="2024-01-01T00:00:00Z">
         <w:r>
           <w:rPr>
             <w:b/>
@@ -28894,12 +28911,12 @@
           <w:t xml:space="preserve">Branch:</w:t>
         </w:r>
       </w:ins>
-      <w:ins w:id="987" w:author="PR Preview" w:date="2024-01-01T00:00:00Z">
+      <w:ins w:id="988" w:author="PR Preview" w:date="2024-01-01T00:00:00Z">
         <w:r>
           <w:t xml:space="preserve"> </w:t>
         </w:r>
       </w:ins>
-      <w:ins w:id="987" w:author="PR Preview" w:date="2024-01-01T00:00:00Z">
+      <w:ins w:id="988" w:author="PR Preview" w:date="2024-01-01T00:00:00Z">
         <w:r>
           <w:t xml:space="preserve">HEAD</w:t>
         </w:r>
@@ -28913,7 +28930,7 @@
           <w:numId w:val="1166"/>
         </w:numPr>
       </w:pPr>
-      <w:ins w:id="988" w:author="PR Preview" w:date="2024-01-01T00:00:00Z">
+      <w:ins w:id="989" w:author="PR Preview" w:date="2024-01-01T00:00:00Z">
         <w:r>
           <w:rPr>
             <w:b/>
@@ -28922,14 +28939,14 @@
           <w:t xml:space="preserve">Commit:</w:t>
         </w:r>
       </w:ins>
-      <w:ins w:id="988" w:author="PR Preview" w:date="2024-01-01T00:00:00Z">
+      <w:ins w:id="989" w:author="PR Preview" w:date="2024-01-01T00:00:00Z">
         <w:r>
           <w:t xml:space="preserve"> </w:t>
         </w:r>
       </w:ins>
-      <w:ins w:id="988" w:author="PR Preview" w:date="2024-01-01T00:00:00Z">
-        <w:r>
-          <w:t xml:space="preserve">e80ccec</w:t>
+      <w:ins w:id="989" w:author="PR Preview" w:date="2024-01-01T00:00:00Z">
+        <w:r>
+          <w:t xml:space="preserve">9175faa</w:t>
         </w:r>
       </w:ins>
     </w:p>
@@ -28941,7 +28958,7 @@
           <w:numId w:val="1166"/>
         </w:numPr>
       </w:pPr>
-      <w:ins w:id="989" w:author="PR Preview" w:date="2024-01-01T00:00:00Z">
+      <w:ins w:id="990" w:author="PR Preview" w:date="2024-01-01T00:00:00Z">
         <w:r>
           <w:rPr>
             <w:b/>
@@ -28950,14 +28967,14 @@
           <w:t xml:space="preserve">Full commit hash:</w:t>
         </w:r>
       </w:ins>
-      <w:ins w:id="989" w:author="PR Preview" w:date="2024-01-01T00:00:00Z">
+      <w:ins w:id="990" w:author="PR Preview" w:date="2024-01-01T00:00:00Z">
         <w:r>
           <w:t xml:space="preserve"> </w:t>
         </w:r>
       </w:ins>
-      <w:ins w:id="989" w:author="PR Preview" w:date="2024-01-01T00:00:00Z">
-        <w:r>
-          <w:t xml:space="preserve">e80ccec98788fe9b3ed552a3a8475a7f345ffea0</w:t>
+      <w:ins w:id="990" w:author="PR Preview" w:date="2024-01-01T00:00:00Z">
+        <w:r>
+          <w:t xml:space="preserve">9175faaacbc1a8c9d22c726cb75c60063371df0e</w:t>
         </w:r>
       </w:ins>
     </w:p>
@@ -28969,7 +28986,7 @@
           <w:numId w:val="1166"/>
         </w:numPr>
       </w:pPr>
-      <w:ins w:id="990" w:author="PR Preview" w:date="2024-01-01T00:00:00Z">
+      <w:ins w:id="991" w:author="PR Preview" w:date="2024-01-01T00:00:00Z">
         <w:r>
           <w:rPr>
             <w:b/>
@@ -28978,14 +28995,14 @@
           <w:t xml:space="preserve">Commit date:</w:t>
         </w:r>
       </w:ins>
-      <w:ins w:id="990" w:author="PR Preview" w:date="2024-01-01T00:00:00Z">
+      <w:ins w:id="991" w:author="PR Preview" w:date="2024-01-01T00:00:00Z">
         <w:r>
           <w:t xml:space="preserve"> </w:t>
         </w:r>
       </w:ins>
-      <w:ins w:id="990" w:author="PR Preview" w:date="2024-01-01T00:00:00Z">
-        <w:r>
-          <w:t xml:space="preserve">2026-10-14 08:52:23 +0000</w:t>
+      <w:ins w:id="991" w:author="PR Preview" w:date="2024-01-01T00:00:00Z">
+        <w:r>
+          <w:t xml:space="preserve">2026-10-14 09:04:53 +0000</w:t>
         </w:r>
       </w:ins>
     </w:p>

</xml_diff>